<commit_message>
Realinha resumo ao achado de autoria e fecha revisao do roteiro
</commit_message>
<xml_diff>
--- a/roteiro_tjdft_publico.docx
+++ b/roteiro_tjdft_publico.docx
@@ -67,7 +67,7 @@
         <w:spacing w:after="160"/>
       </w:pPr>
       <w:r>
-        <w:t>Este documento descreve um pipeline de Processamento de Linguagem Natural aplicado a 606 acórdãos da 7ª Turma Cível do Tribunal de Justiça do Distrito Federal e dos Territórios (TJDFT), coletados via API oficial para o período de 2022 a 2025. O objetivo foi identificar padrões temáticos emergentes no corpus sem necessidade de rotulação manual, utilizando embeddings gerados pelo modelo BERTimbau e modelagem de tópicos com BERTopic. Foram identificados 9 tópicos com palavras-chave semanticamente coerentes. O Coeficiente de Silhueta obtido foi de 0.1388, valor esperado para corpus jurídico homogêneo.</w:t>
+        <w:t>Este documento descreve um pipeline de Processamento de Linguagem Natural aplicado a 606 acórdãos da 7ª Turma Cível do Tribunal de Justiça do Distrito Federal e dos Territórios (TJDFT), coletados via API oficial para o período de 2022 a 2025. O objetivo foi identificar padrões temáticos emergentes no corpus sem necessidade de rotulação manual, utilizando embeddings gerados pelo modelo BERTimbau e modelagem de tópicos com BERTopic. Foram identificados 9 agrupamentos. A inspeção revelou que parte deles reflete não o tema jurídico, mas o estilo de redação do relator e o tipo de peça processual — um achado característico de corpus de turma única, discutido na seção de limitações. O Coeficiente de Silhueta obtido foi de 0.1388, valor esperado para corpus jurídico homogêneo.</w:t>
       </w:r>
     </w:p>
     <w:p>
@@ -232,6 +232,14 @@
     </w:p>
     <w:p>
       <w:pPr>
+        <w:spacing w:after="160"/>
+      </w:pPr>
+      <w:r>
+        <w:t>O termo de busca utilizado na coleta foi “alimentos”. Cabe registrar que esse termo é ambíguo no português jurídico, designando tanto a pensão alimentícia (direito de família) quanto o gênero alimentício. Por isso, o corpus inclui decisões envolvendo empresas do setor de alimentos, que emergiram como agrupamento próprio na modelagem (Tópico 5). Trata-se de uma limitação conhecida da coleta por palavra-chave, registrada aqui em nome da transparência metodológica.</w:t>
+      </w:r>
+    </w:p>
+    <w:p>
+      <w:pPr>
         <w:spacing w:after="120"/>
       </w:pPr>
     </w:p>
@@ -479,6 +487,19 @@
       <w:r>
         <w:t>5. Modelagem de tópicos com BERTopic</w:t>
       </w:r>
+    </w:p>
+    <w:p>
+      <w:pPr>
+        <w:spacing w:after="160"/>
+      </w:pPr>
+      <w:r>
+        <w:t>A adequação do BERTopic a decisões judiciais brasileiras já foi demonstrada por Aguiar et al. (2022) [11], que obtiveram F1 macro de 89% ao categorizar processos do Supremo Tribunal Federal em classes do CNJ — o que respalda a escolha do método para o presente corpus.</w:t>
+      </w:r>
+    </w:p>
+    <w:p>
+      <w:pPr>
+        <w:spacing w:after="120"/>
+      </w:pPr>
     </w:p>
     <w:p>
       <w:pPr>

</xml_diff>